<commit_message>
Update Windows 11 documentation file
Revised the Documentación Si Windows 11.docx file with new or updated content.
</commit_message>
<xml_diff>
--- a/Sistemas Informaticos/Nueva carpeta/Documentación Si Windows 11.docx
+++ b/Sistemas Informaticos/Nueva carpeta/Documentación Si Windows 11.docx
@@ -7,6 +7,8 @@
         <w:pStyle w:val="Ttulo"/>
         <w:jc w:val="center"/>
       </w:pPr>
+      <w:bookmarkStart w:id="0" w:name="_GoBack"/>
+      <w:bookmarkEnd w:id="0"/>
       <w:r>
         <w:t>2.7 Instalación de Windows 11 en una máquina virtual con Virtual Box</w:t>
       </w:r>
@@ -18,6 +20,13 @@
     </w:p>
     <w:sdt>
       <w:sdtPr>
+        <w:rPr>
+          <w:rFonts w:asciiTheme="minorHAnsi" w:eastAsiaTheme="minorHAnsi" w:hAnsiTheme="minorHAnsi" w:cstheme="minorBidi"/>
+          <w:color w:val="auto"/>
+          <w:sz w:val="22"/>
+          <w:szCs w:val="22"/>
+          <w:lang w:eastAsia="en-US"/>
+        </w:rPr>
         <w:id w:val="2133595539"/>
         <w:docPartObj>
           <w:docPartGallery w:val="Table of Contents"/>
@@ -26,13 +35,8 @@
       </w:sdtPr>
       <w:sdtEndPr>
         <w:rPr>
-          <w:rFonts w:asciiTheme="minorHAnsi" w:eastAsiaTheme="minorHAnsi" w:hAnsiTheme="minorHAnsi" w:cstheme="minorBidi"/>
           <w:b/>
           <w:bCs/>
-          <w:color w:val="auto"/>
-          <w:sz w:val="22"/>
-          <w:szCs w:val="22"/>
-          <w:lang w:eastAsia="en-US"/>
         </w:rPr>
       </w:sdtEndPr>
       <w:sdtContent>
@@ -621,8 +625,6 @@
       <w:r>
         <w:br w:type="page"/>
       </w:r>
-      <w:bookmarkStart w:id="0" w:name="_GoBack"/>
-      <w:bookmarkEnd w:id="0"/>
     </w:p>
     <w:p>
       <w:pPr>
@@ -1980,7 +1982,7 @@
 </file>
 
 <file path=customXml/itemProps1.xml><?xml version="1.0" encoding="utf-8"?>
-<ds:datastoreItem xmlns:ds="http://schemas.openxmlformats.org/officeDocument/2006/customXml" ds:itemID="{42475CA3-D33D-4090-AA50-4E75FC080C94}">
+<ds:datastoreItem xmlns:ds="http://schemas.openxmlformats.org/officeDocument/2006/customXml" ds:itemID="{5395AD8A-A311-4179-883A-0184D1571639}">
   <ds:schemaRefs>
     <ds:schemaRef ds:uri="http://schemas.openxmlformats.org/officeDocument/2006/bibliography"/>
   </ds:schemaRefs>

</xml_diff>